<commit_message>
docs: update tech stack report with UN auto-grounding and landing refresh
Documents the new always-on UN Digital Library grounding for Module A
(query-broadening retries, source_speech metadata), the MCQ answer-field
fix, Arabic search-query translation, word-count expansion pass, and the
landing page UI refresh (language tabs, metric cards, repositioned globe,
login card styling).

Co-Authored-By: Claude Sonnet 4.6 <noreply@anthropic.com>
</commit_message>
<xml_diff>
--- a/TECH_STACK_REPORT.docx
+++ b/TECH_STACK_REPORT.docx
@@ -535,6 +535,14 @@
       </w:r>
     </w:p>
     <w:p>
+      <w:pPr>
+        <w:pStyle w:val="ListBullet"/>
+      </w:pPr>
+      <w:r>
+        <w:t>Word-count enforcement: LLMs frequently undershoot the requested word count (observed ~30% short, e.g. 200 -&gt; 143 words). build_generation_response() now checks the generated script against the requested word_count and, if it falls below 90% of the target, makes one follow-up LLM call asking it to expand the script in place (preserving wording, facts, and structure) before computing the final word_count/duration.</w:t>
+      </w:r>
+    </w:p>
+    <w:p>
       <w:r>
         <w:t>This replaced an earlier, simpler "generate N words about topic X" prompt that produced shallow MCQs (e.g. "What is the topic about?") and inconsistent word counts.</w:t>
       </w:r>
@@ -590,6 +598,30 @@
       </w:pPr>
       <w:r>
         <w:t>The retrieved text is then fed to Module A's /from-document endpoint as grounding material for generation.</w:t>
+      </w:r>
+    </w:p>
+    <w:p>
+      <w:pPr>
+        <w:pStyle w:val="ListBullet"/>
+      </w:pPr>
+      <w:r>
+        <w:t>Automatic grounding (Module A /generate): speech generation no longer requires the user to search the library manually. find_un_grounding_source() builds a list of progressively broader UN Digital Library queries from the topic and domain (exact topic -&gt; topic + domain keywords -&gt; domain keywords -&gt; shortened topic), tries English then French sources for each (more reliable PDF text extraction than older Arabic UN documents), and stops at the first document yielding at least 80 words of usable text. The extracted text is chunked and the most relevant excerpts are passed to the LLM as grounding context.</w:t>
+      </w:r>
+    </w:p>
+    <w:p>
+      <w:pPr>
+        <w:pStyle w:val="ListBullet"/>
+      </w:pPr>
+      <w:r>
+        <w:t>The /generate response now reports mode: "un_library_grounded" with source_speech metadata (title, UN record ID, web URL, date) when a real document was used, or mode: "generated" if no usable document was found after exhausting all broadened queries.</w:t>
+      </w:r>
+    </w:p>
+    <w:p>
+      <w:pPr>
+        <w:pStyle w:val="ListBullet"/>
+      </w:pPr>
+      <w:r>
+        <w:t>Arabic-script search queries (used in the manual UN Library search panel) previously matched zero results because the UN catalog metadata (titles/abstracts) is indexed in English/French. Arabic queries are now translated to English keywords via the LLM before being sent to the UN search API; the selected language still controls which PDF version (Arabic) is fetched.</w:t>
       </w:r>
     </w:p>
     <w:p>
@@ -752,6 +784,14 @@
     </w:p>
     <w:p>
       <w:pPr>
+        <w:pStyle w:val="ListBullet"/>
+      </w:pPr>
+      <w:r>
+        <w:t>Bug fixed (Module A, Arabic MCQs): the _clean_arabic_script filter (designed to strip stray Latin/CJK characters from Arabic script output) was also being applied to MCQ "answer" fields, wiping single-letter answers like "C" to an empty string because Latin letters A-D are not in the Arabic Unicode range. MCQ answers are now left as-is (a short option label, never run through the Arabic-only filter).</w:t>
+      </w:r>
+    </w:p>
+    <w:p>
+      <w:pPr>
         <w:pStyle w:val="Heading1"/>
       </w:pPr>
       <w:r>
@@ -870,6 +910,30 @@
       </w:pPr>
       <w:r>
         <w:t>Module D evaluation re-uses the recorded audio blob (re-transcribed server-side with full word-level data) instead of relying only on the earlier transcript.</w:t>
+      </w:r>
+    </w:p>
+    <w:p>
+      <w:pPr>
+        <w:pStyle w:val="ListBullet"/>
+      </w:pPr>
+      <w:r>
+        <w:t>Module A result now displays a "Grounded in real UN document" badge linking to the source record (title + date) when mode is un_library_grounded, or a note explaining the speech was generated without source grounding otherwise.</w:t>
+      </w:r>
+    </w:p>
+    <w:p>
+      <w:pPr>
+        <w:pStyle w:val="ListBullet"/>
+      </w:pPr>
+      <w:r>
+        <w:t>Landing page refresh: the three floating language pills were replaced with an underline-style "Train in:" tab switcher; the two tall stat cards were replaced with a compact row of three equal-width metric cards (Sessions / Languages / Modes); the login/signup card gained a gold top accent border and a deeper shadow.</w:t>
+      </w:r>
+    </w:p>
+    <w:p>
+      <w:pPr>
+        <w:pStyle w:val="ListBullet"/>
+      </w:pPr>
+      <w:r>
+        <w:t>Three.js globe background: repositioned from an off-center placement to sit beside the sign-in card (scaled to 60%, opacity reduced to ~0.32) so it reads as a subtle background texture and no longer overlaps or obscures the hero text.</w:t>
       </w:r>
     </w:p>
     <w:p>
@@ -1203,8 +1267,293 @@
           </w:p>
         </w:tc>
       </w:tr>
+      <w:tr>
+        <w:tc>
+          <w:tcPr>
+            <w:tcW w:type="dxa" w:w="2880"/>
+          </w:tcPr>
+          <w:p>
+            <w:r>
+              <w:t>Module A grounding trigger</w:t>
+            </w:r>
+          </w:p>
+        </w:tc>
+        <w:tc>
+          <w:tcPr>
+            <w:tcW w:type="dxa" w:w="2880"/>
+          </w:tcPr>
+          <w:p>
+            <w:r>
+              <w:t>User manually searches UN Library, then generates from a saved speech</w:t>
+            </w:r>
+          </w:p>
+        </w:tc>
+        <w:tc>
+          <w:tcPr>
+            <w:tcW w:type="dxa" w:w="2880"/>
+          </w:tcPr>
+          <w:p>
+            <w:r>
+              <w:t>Module A /generate always auto-searches UN Digital Library based on topic/domain, with broadened-query retries</w:t>
+            </w:r>
+          </w:p>
+        </w:tc>
+      </w:tr>
+      <w:tr>
+        <w:tc>
+          <w:tcPr>
+            <w:tcW w:type="dxa" w:w="2880"/>
+          </w:tcPr>
+          <w:p>
+            <w:r>
+              <w:t>MCQ answer field (Arabic)</w:t>
+            </w:r>
+          </w:p>
+        </w:tc>
+        <w:tc>
+          <w:tcPr>
+            <w:tcW w:type="dxa" w:w="2880"/>
+          </w:tcPr>
+          <w:p>
+            <w:r>
+              <w:t>Wiped to "" by Arabic-only text filter</w:t>
+            </w:r>
+          </w:p>
+        </w:tc>
+        <w:tc>
+          <w:tcPr>
+            <w:tcW w:type="dxa" w:w="2880"/>
+          </w:tcPr>
+          <w:p>
+            <w:r>
+              <w:t>Left unfiltered — short option labels (A-D) preserved</w:t>
+            </w:r>
+          </w:p>
+        </w:tc>
+      </w:tr>
+      <w:tr>
+        <w:tc>
+          <w:tcPr>
+            <w:tcW w:type="dxa" w:w="2880"/>
+          </w:tcPr>
+          <w:p>
+            <w:r>
+              <w:t>UN Library search (Arabic input)</w:t>
+            </w:r>
+          </w:p>
+        </w:tc>
+        <w:tc>
+          <w:tcPr>
+            <w:tcW w:type="dxa" w:w="2880"/>
+          </w:tcPr>
+          <w:p>
+            <w:r>
+              <w:t>Arabic-script queries returned 0 results</w:t>
+            </w:r>
+          </w:p>
+        </w:tc>
+        <w:tc>
+          <w:tcPr>
+            <w:tcW w:type="dxa" w:w="2880"/>
+          </w:tcPr>
+          <w:p>
+            <w:r>
+              <w:t>Arabic queries auto-translated to English keywords before searching</w:t>
+            </w:r>
+          </w:p>
+        </w:tc>
+      </w:tr>
+      <w:tr>
+        <w:tc>
+          <w:tcPr>
+            <w:tcW w:type="dxa" w:w="2880"/>
+          </w:tcPr>
+          <w:p>
+            <w:r>
+              <w:t>Script word count</w:t>
+            </w:r>
+          </w:p>
+        </w:tc>
+        <w:tc>
+          <w:tcPr>
+            <w:tcW w:type="dxa" w:w="2880"/>
+          </w:tcPr>
+          <w:p>
+            <w:r>
+              <w:t>Often ~30% short of requested word_count</w:t>
+            </w:r>
+          </w:p>
+        </w:tc>
+        <w:tc>
+          <w:tcPr>
+            <w:tcW w:type="dxa" w:w="2880"/>
+          </w:tcPr>
+          <w:p>
+            <w:r>
+              <w:t>Follow-up LLM expansion pass if script is &lt;90% of target</w:t>
+            </w:r>
+          </w:p>
+        </w:tc>
+      </w:tr>
+      <w:tr>
+        <w:tc>
+          <w:tcPr>
+            <w:tcW w:type="dxa" w:w="2880"/>
+          </w:tcPr>
+          <w:p>
+            <w:r>
+              <w:t>Landing page hero</w:t>
+            </w:r>
+          </w:p>
+        </w:tc>
+        <w:tc>
+          <w:tcPr>
+            <w:tcW w:type="dxa" w:w="2880"/>
+          </w:tcPr>
+          <w:p>
+            <w:r>
+              <w:t>Language pill badges, tall stat cards, off-center 3D globe</w:t>
+            </w:r>
+          </w:p>
+        </w:tc>
+        <w:tc>
+          <w:tcPr>
+            <w:tcW w:type="dxa" w:w="2880"/>
+          </w:tcPr>
+          <w:p>
+            <w:r>
+              <w:t>Underline language tabs, compact metric row, globe repositioned beside login card at low opacity</w:t>
+            </w:r>
+          </w:p>
+        </w:tc>
+      </w:tr>
     </w:tbl>
     <w:p/>
+    <w:p>
+      <w:pPr>
+        <w:pStyle w:val="Heading1"/>
+      </w:pPr>
+      <w:r>
+        <w:t>12. Update — UN Auto-Grounding &amp; Landing Page Refresh</w:t>
+      </w:r>
+    </w:p>
+    <w:p>
+      <w:r>
+        <w:t>This section summarises the changes made on top of the state described above, on branch feature/un-auto-grounding-landing-refresh.</w:t>
+      </w:r>
+    </w:p>
+    <w:p>
+      <w:pPr>
+        <w:pStyle w:val="Heading2"/>
+      </w:pPr>
+      <w:r>
+        <w:t>Module A — automatic UN Digital Library grounding</w:t>
+      </w:r>
+    </w:p>
+    <w:p>
+      <w:pPr>
+        <w:pStyle w:val="ListBullet"/>
+      </w:pPr>
+      <w:r>
+        <w:t>Every call to POST /api/module-a/generate now searches the UN Digital Library automatically (no manual search step), using a query-broadening strategy derived from the topic and domain.</w:t>
+      </w:r>
+    </w:p>
+    <w:p>
+      <w:pPr>
+        <w:pStyle w:val="ListBullet"/>
+      </w:pPr>
+      <w:r>
+        <w:t>English/French documents are preferred as grounding sources because their PDFs extract far more reliably than older Arabic UN PDFs (which often use custom CID fonts that decode to mojibake); the LLM still writes the final script in the requested output language.</w:t>
+      </w:r>
+    </w:p>
+    <w:p>
+      <w:pPr>
+        <w:pStyle w:val="ListBullet"/>
+      </w:pPr>
+      <w:r>
+        <w:t>Verified end-to-end: a request for "climate finance for developing countries" (AR -&gt; FR, domain=climate) returned mode=un_library_grounded with source UN record 4067938 ("Programme of Action for Landlocked Developing Countries...") and incorporated real figures (32 landlocked developing countries, 570 million people) into the generated Arabic script.</w:t>
+      </w:r>
+    </w:p>
+    <w:p>
+      <w:pPr>
+        <w:pStyle w:val="Heading2"/>
+      </w:pPr>
+      <w:r>
+        <w:t>Fixes</w:t>
+      </w:r>
+    </w:p>
+    <w:p>
+      <w:pPr>
+        <w:pStyle w:val="ListBullet"/>
+      </w:pPr>
+      <w:r>
+        <w:t>MCQ "answer" field for Arabic-language speeches was being wiped to an empty string by the Arabic-only character filter; fixed by leaving the answer label unfiltered.</w:t>
+      </w:r>
+    </w:p>
+    <w:p>
+      <w:pPr>
+        <w:pStyle w:val="ListBullet"/>
+      </w:pPr>
+      <w:r>
+        <w:t>UN Digital Library search queries typed in Arabic script returned zero results (catalog is indexed in English/French); fixed by translating Arabic queries to English via the LLM before searching, while the language selector still controls which PDF is fetched.</w:t>
+      </w:r>
+    </w:p>
+    <w:p>
+      <w:pPr>
+        <w:pStyle w:val="ListBullet"/>
+      </w:pPr>
+      <w:r>
+        <w:t>Generated scripts often fell short of the requested word_count (e.g. 200 -&gt; 143 words); a follow-up LLM expansion pass now brings the script closer to the target (e.g. 200 -&gt; 176 words in testing) while preserving wording and facts.</w:t>
+      </w:r>
+    </w:p>
+    <w:p>
+      <w:pPr>
+        <w:pStyle w:val="Heading2"/>
+      </w:pPr>
+      <w:r>
+        <w:t>Frontend — landing page refresh</w:t>
+      </w:r>
+    </w:p>
+    <w:p>
+      <w:pPr>
+        <w:pStyle w:val="ListBullet"/>
+      </w:pPr>
+      <w:r>
+        <w:t>Replaced the three floating language pills with an underline-style "Train in:" tab switcher, and added breathing room (2rem) before the H1 headline.</w:t>
+      </w:r>
+    </w:p>
+    <w:p>
+      <w:pPr>
+        <w:pStyle w:val="ListBullet"/>
+      </w:pPr>
+      <w:r>
+        <w:t>Replaced the two tall stat cards with a compact row of three equal-width metric cards (Sessions / Languages / Modes), removing the large emoji icons.</w:t>
+      </w:r>
+    </w:p>
+    <w:p>
+      <w:pPr>
+        <w:pStyle w:val="ListBullet"/>
+      </w:pPr>
+      <w:r>
+        <w:t>Fixed the Three.js globe: it was off-center and barely visible (opacity 0.08). It is now repositioned beside the sign-in card, scaled to 60%, and set to ~0.32 opacity so it reads as a subtle background texture without overlapping the hero text.</w:t>
+      </w:r>
+    </w:p>
+    <w:p>
+      <w:pPr>
+        <w:pStyle w:val="ListBullet"/>
+      </w:pPr>
+      <w:r>
+        <w:t>Added a 3px gold top accent border and a slightly deeper shadow to the login/signup card, and made the "Create an account" switch link larger (14px) and semi-bold (500 weight).</w:t>
+      </w:r>
+    </w:p>
+    <w:p>
+      <w:pPr>
+        <w:pStyle w:val="ListBullet"/>
+      </w:pPr>
+      <w:r>
+        <w:t>Module A results now show a badge linking to the real UN source document (title + date) when the speech was grounded, or a note when it was generated without a source.</w:t>
+      </w:r>
+    </w:p>
     <w:sectPr>
       <w:pgSz w:w="12240" w:h="15840"/>
       <w:pgMar w:top="1440" w:right="1800" w:bottom="1440" w:left="1800" w:header="720" w:footer="720" w:gutter="0"/>

</xml_diff>